<commit_message>
docs: documentation and time table
</commit_message>
<xml_diff>
--- a/docs/JIPA_Nikola_2027.docx
+++ b/docs/JIPA_Nikola_2027.docx
@@ -2851,19 +2851,7 @@
           <w:rPr>
             <w:rStyle w:val="Hyperlink"/>
           </w:rPr>
-          <w:t>Infor</w:t>
-        </w:r>
-        <w:r>
-          <w:rPr>
-            <w:rStyle w:val="Hyperlink"/>
-          </w:rPr>
-          <w:t>m</w:t>
-        </w:r>
-        <w:r>
-          <w:rPr>
-            <w:rStyle w:val="Hyperlink"/>
-          </w:rPr>
-          <w:t>ieren</w:t>
+          <w:t>Informieren</w:t>
         </w:r>
         <w:r>
           <w:rPr>
@@ -3218,21 +3206,7 @@
             <w:rStyle w:val="Hyperlink"/>
             <w:highlight w:val="yellow"/>
           </w:rPr>
-          <w:t>Verfein</w:t>
-        </w:r>
-        <w:r>
-          <w:rPr>
-            <w:rStyle w:val="Hyperlink"/>
-            <w:highlight w:val="yellow"/>
-          </w:rPr>
-          <w:t>e</w:t>
-        </w:r>
-        <w:r>
-          <w:rPr>
-            <w:rStyle w:val="Hyperlink"/>
-            <w:highlight w:val="yellow"/>
-          </w:rPr>
-          <w:t>rung des Auftrages</w:t>
+          <w:t>Verfeinerung des Auftrages</w:t>
         </w:r>
         <w:r>
           <w:rPr>
@@ -3487,19 +3461,7 @@
           <w:rPr>
             <w:rStyle w:val="Hyperlink"/>
           </w:rPr>
-          <w:t>Anforderun</w:t>
-        </w:r>
-        <w:r>
-          <w:rPr>
-            <w:rStyle w:val="Hyperlink"/>
-          </w:rPr>
-          <w:t>g</w:t>
-        </w:r>
-        <w:r>
-          <w:rPr>
-            <w:rStyle w:val="Hyperlink"/>
-          </w:rPr>
-          <w:t>sanalyse</w:t>
+          <w:t>Anforderungsanalyse</w:t>
         </w:r>
         <w:r>
           <w:rPr>
@@ -4583,19 +4545,7 @@
           <w:rPr>
             <w:rStyle w:val="Hyperlink"/>
           </w:rPr>
-          <w:t>Abg</w:t>
-        </w:r>
-        <w:r>
-          <w:rPr>
-            <w:rStyle w:val="Hyperlink"/>
-          </w:rPr>
-          <w:t>r</w:t>
-        </w:r>
-        <w:r>
-          <w:rPr>
-            <w:rStyle w:val="Hyperlink"/>
-          </w:rPr>
-          <w:t>enzung</w:t>
+          <w:t>Abgrenzung</w:t>
         </w:r>
         <w:r>
           <w:rPr>
@@ -34417,6 +34367,7 @@
         <w:rPr>
           <w:rFonts w:asciiTheme="majorHAnsi" w:eastAsiaTheme="majorEastAsia" w:hAnsiTheme="majorHAnsi" w:cstheme="majorBidi"/>
           <w:bCs/>
+          <w:noProof/>
           <w:spacing w:val="-10"/>
           <w:kern w:val="28"/>
         </w:rPr>
@@ -35024,6 +34975,32 @@
           <w:szCs w:val="20"/>
         </w:rPr>
       </w:pPr>
+      <w:r>
+        <w:rPr>
+          <w:sz w:val="20"/>
+          <w:szCs w:val="20"/>
+        </w:rPr>
+        <w:t>Die Abbildung zeigt den Aufbau des Gesamtsystems auf dem lokalen Entwicklungsrechner. Das API-Backend mit Node.js und Express.js, die MySQL-Datenbank und phpMyAdmin werden innerhalb einer Docker-Umgebung betrieben. Über die im Browser geöffnete Swagger UI können die API-Endpunkte angezeigt und getestet werden. Die HTTP-Anfragen werden vom Backend entgegengenommen, validiert und verarbeitet. Für das Lesen und Speichern der Daten kommuniziert das Backend über SQL-Abfragen mit der MySQL-Datenbank. Die Antworten werden im JSON-Format an den Browser zurückgegeben. phpMyAdmin dient zur Verwaltung und Kontrolle der Datenbank.</w:t>
+      </w:r>
+    </w:p>
+    <w:p>
+      <w:pPr>
+        <w:pStyle w:val="Lauftext"/>
+        <w:rPr>
+          <w:sz w:val="20"/>
+          <w:szCs w:val="20"/>
+        </w:rPr>
+      </w:pPr>
+    </w:p>
+    <w:p>
+      <w:pPr>
+        <w:rPr>
+          <w:rFonts w:asciiTheme="majorHAnsi" w:hAnsiTheme="majorHAnsi"/>
+        </w:rPr>
+      </w:pPr>
+      <w:r>
+        <w:br w:type="page"/>
+      </w:r>
     </w:p>
     <w:p>
       <w:pPr>
@@ -35042,6 +35019,7 @@
         <w:rPr>
           <w:szCs w:val="20"/>
         </w:rPr>
+        <w:lastRenderedPageBreak/>
         <w:t>Vorgehensweise</w:t>
       </w:r>
       <w:bookmarkEnd w:id="200"/>

</xml_diff>

<commit_message>
docs: documentation and timetable feat: basic structure api
</commit_message>
<xml_diff>
--- a/docs/JIPA_Nikola_2027.docx
+++ b/docs/JIPA_Nikola_2027.docx
@@ -7450,14 +7450,7 @@
       </w:r>
       <w:r>
         <w:br/>
-      </w:r>
-      <w:proofErr w:type="gramStart"/>
-      <w:r>
-        <w:t>Nachfolgend</w:t>
-      </w:r>
-      <w:proofErr w:type="gramEnd"/>
-      <w:r>
-        <w:t>…</w:t>
+        <w:t>Nachfolgend…</w:t>
       </w:r>
       <w:r>
         <w:br/>
@@ -7582,29 +7575,13 @@
         <w:t>Im Betrieb und im Privaten kenne ich Personen, welche sich mit Pflanzen auseinandersetzen</w:t>
       </w:r>
       <w:r>
-        <w:t xml:space="preserve">. Die Personen benötigen </w:t>
-      </w:r>
-      <w:proofErr w:type="gramStart"/>
-      <w:r>
-        <w:t>einen Ort</w:t>
-      </w:r>
-      <w:proofErr w:type="gramEnd"/>
-      <w:r>
-        <w:t xml:space="preserve"> wo sie ihre Pflanzen eintragen</w:t>
+        <w:t>. Die Personen benötigen einen Ort wo sie ihre Pflanzen eintragen</w:t>
       </w:r>
       <w:r>
         <w:t xml:space="preserve">, dazu die passende Pflegeweise und weitere Fakten über die Pflanze beifügen möchten. </w:t>
       </w:r>
       <w:r>
-        <w:t xml:space="preserve">Hier wird nur das Backend-Bereich </w:t>
-      </w:r>
-      <w:proofErr w:type="gramStart"/>
-      <w:r>
-        <w:t>umgesetzt</w:t>
-      </w:r>
-      <w:proofErr w:type="gramEnd"/>
-      <w:r>
-        <w:t xml:space="preserve"> welches die Daten verwaltet und schlussendlich am Frontend übergibt. </w:t>
+        <w:t xml:space="preserve">Hier wird nur das Backend-Bereich umgesetzt welches die Daten verwaltet und schlussendlich am Frontend übergibt. </w:t>
       </w:r>
     </w:p>
     <w:p/>
@@ -7862,69 +7839,21 @@
           <w:sz w:val="20"/>
           <w:szCs w:val="20"/>
         </w:rPr>
-        <w:t xml:space="preserve">Mit Fehleingaben muss es auch umgehen können, zum Beispiel wenn in einer Spalte etwas </w:t>
-      </w:r>
-      <w:proofErr w:type="gramStart"/>
-      <w:r>
-        <w:rPr>
-          <w:sz w:val="20"/>
-          <w:szCs w:val="20"/>
-        </w:rPr>
-        <w:t>falsches</w:t>
-      </w:r>
-      <w:proofErr w:type="gramEnd"/>
-      <w:r>
-        <w:rPr>
-          <w:sz w:val="20"/>
-          <w:szCs w:val="20"/>
-        </w:rPr>
-        <w:t xml:space="preserve"> </w:t>
-      </w:r>
-      <w:r>
-        <w:rPr>
-          <w:sz w:val="20"/>
-          <w:szCs w:val="20"/>
-        </w:rPr>
-        <w:t xml:space="preserve">eingegeben wird, </w:t>
-      </w:r>
-      <w:proofErr w:type="gramStart"/>
-      <w:r>
-        <w:rPr>
-          <w:sz w:val="20"/>
-          <w:szCs w:val="20"/>
-        </w:rPr>
-        <w:t>das</w:t>
-      </w:r>
-      <w:proofErr w:type="gramEnd"/>
-      <w:r>
-        <w:rPr>
-          <w:sz w:val="20"/>
-          <w:szCs w:val="20"/>
-        </w:rPr>
-        <w:t xml:space="preserve"> es nicht einfach fort</w:t>
-      </w:r>
-      <w:r>
-        <w:rPr>
-          <w:sz w:val="20"/>
-          <w:szCs w:val="20"/>
-        </w:rPr>
-        <w:t xml:space="preserve">fährt, sondern </w:t>
-      </w:r>
-      <w:proofErr w:type="gramStart"/>
-      <w:r>
-        <w:rPr>
-          <w:sz w:val="20"/>
-          <w:szCs w:val="20"/>
-        </w:rPr>
-        <w:t>das</w:t>
-      </w:r>
-      <w:proofErr w:type="gramEnd"/>
-      <w:r>
-        <w:rPr>
-          <w:sz w:val="20"/>
-          <w:szCs w:val="20"/>
-        </w:rPr>
-        <w:t xml:space="preserve"> eine Fehlermeldung erhält und den Nutzer darauf hinweist. </w:t>
+        <w:t xml:space="preserve">Mit Fehleingaben muss es auch umgehen können, zum Beispiel wenn in einer Spalte etwas falsches </w:t>
+      </w:r>
+      <w:r>
+        <w:rPr>
+          <w:sz w:val="20"/>
+          <w:szCs w:val="20"/>
+        </w:rPr>
+        <w:t>eingegeben wird, das es nicht einfach fort</w:t>
+      </w:r>
+      <w:r>
+        <w:rPr>
+          <w:sz w:val="20"/>
+          <w:szCs w:val="20"/>
+        </w:rPr>
+        <w:t xml:space="preserve">fährt, sondern das eine Fehlermeldung erhält und den Nutzer darauf hinweist. </w:t>
       </w:r>
     </w:p>
     <w:p>
@@ -8390,19 +8319,8 @@
           <w:highlight w:val="yellow"/>
           <w:u w:val="single"/>
         </w:rPr>
-        <w:t xml:space="preserve">Beschreiben, falls mehrere Umsetzungsvarianten geplant </w:t>
-      </w:r>
-      <w:proofErr w:type="gramStart"/>
-      <w:r>
-        <w:rPr>
-          <w:sz w:val="20"/>
-          <w:szCs w:val="20"/>
-          <w:highlight w:val="yellow"/>
-          <w:u w:val="single"/>
-        </w:rPr>
-        <w:t>sind</w:t>
-      </w:r>
-      <w:proofErr w:type="gramEnd"/>
+        <w:t>Beschreiben, falls mehrere Umsetzungsvarianten geplant sind</w:t>
+      </w:r>
       <w:r>
         <w:rPr>
           <w:sz w:val="20"/>
@@ -8877,15 +8795,7 @@
     </w:p>
     <w:p>
       <w:r>
-        <w:t xml:space="preserve">Organigramm, wer und in welcher Rolle am Projekt </w:t>
-      </w:r>
-      <w:proofErr w:type="gramStart"/>
-      <w:r>
-        <w:t>beteiligt</w:t>
-      </w:r>
-      <w:proofErr w:type="gramEnd"/>
-      <w:r>
-        <w:t xml:space="preserve"> ist</w:t>
+        <w:t>Organigramm, wer und in welcher Rolle am Projekt beteiligt ist</w:t>
       </w:r>
     </w:p>
     <w:p/>
@@ -10833,23 +10743,7 @@
                 <w:sz w:val="20"/>
                 <w:szCs w:val="20"/>
               </w:rPr>
-              <w:t xml:space="preserve">In der Schule im Frontend und </w:t>
-            </w:r>
-            <w:proofErr w:type="gramStart"/>
-            <w:r>
-              <w:rPr>
-                <w:sz w:val="20"/>
-                <w:szCs w:val="20"/>
-              </w:rPr>
-              <w:t>Backend</w:t>
-            </w:r>
-            <w:proofErr w:type="gramEnd"/>
-            <w:r>
-              <w:rPr>
-                <w:sz w:val="20"/>
-                <w:szCs w:val="20"/>
-              </w:rPr>
-              <w:t xml:space="preserve"> </w:t>
+              <w:t xml:space="preserve">In der Schule im Frontend und Backend </w:t>
             </w:r>
             <w:r>
               <w:rPr>
@@ -11021,23 +10915,7 @@
                 <w:sz w:val="20"/>
                 <w:szCs w:val="20"/>
               </w:rPr>
-              <w:t xml:space="preserve">Verwendung von HTTP-Methoden und Austausch von Daten zwischen Frontend und </w:t>
-            </w:r>
-            <w:proofErr w:type="gramStart"/>
-            <w:r>
-              <w:rPr>
-                <w:sz w:val="20"/>
-                <w:szCs w:val="20"/>
-              </w:rPr>
-              <w:t>Backend</w:t>
-            </w:r>
-            <w:proofErr w:type="gramEnd"/>
-            <w:r>
-              <w:rPr>
-                <w:sz w:val="20"/>
-                <w:szCs w:val="20"/>
-              </w:rPr>
-              <w:t xml:space="preserve"> im JSON-Format.</w:t>
+              <w:t>Verwendung von HTTP-Methoden und Austausch von Daten zwischen Frontend und Backend im JSON-Format.</w:t>
             </w:r>
           </w:p>
         </w:tc>
@@ -11935,7 +11813,6 @@
         </w:rPr>
         <w:t xml:space="preserve"> Das API-Backend wird mit Node.js und Express.js umgesetzt und mit der MySQL-Datenbank verbunden. Die Funktionen zur Datenverwaltung, Filterung und Sortierung sowie die Validierung und Fehlerbehandlung werden implementiert. Die API-Endpunkte und die Umsetzung werden </w:t>
       </w:r>
-      <w:proofErr w:type="gramStart"/>
       <w:r>
         <w:rPr>
           <w:sz w:val="20"/>
@@ -11943,7 +11820,6 @@
         </w:rPr>
         <w:t>dokumentiert</w:t>
       </w:r>
-      <w:proofErr w:type="gramEnd"/>
       <w:r>
         <w:rPr>
           <w:sz w:val="20"/>
@@ -12055,15 +11931,7 @@
       </w:r>
       <w:proofErr w:type="spellEnd"/>
       <w:r>
-        <w:t xml:space="preserve">) </w:t>
-      </w:r>
-      <w:proofErr w:type="gramStart"/>
-      <w:r>
-        <w:t>erwähnen,  mit</w:t>
-      </w:r>
-      <w:proofErr w:type="gramEnd"/>
-      <w:r>
-        <w:t xml:space="preserve"> welchem die Datensicherheit sichergestellt wird. Beschreiben, wie und in welchen zeitlichen Abständen   die Datensicherheit gewährleistet wird. </w:t>
+        <w:t xml:space="preserve">) erwähnen,  mit welchem die Datensicherheit sichergestellt wird. Beschreiben, wie und in welchen zeitlichen Abständen   die Datensicherheit gewährleistet wird. </w:t>
       </w:r>
     </w:p>
     <w:p/>
@@ -13839,46 +13707,14 @@
                 <w:sz w:val="20"/>
                 <w:szCs w:val="20"/>
               </w:rPr>
-              <w:t xml:space="preserve"> den Zeitplan einhole. Bei einigen Fragen bleibe ich zu lange </w:t>
-            </w:r>
-            <w:proofErr w:type="gramStart"/>
-            <w:r>
-              <w:rPr>
-                <w:sz w:val="20"/>
-                <w:szCs w:val="20"/>
-              </w:rPr>
-              <w:t>dran</w:t>
-            </w:r>
-            <w:proofErr w:type="gramEnd"/>
-            <w:r>
-              <w:rPr>
-                <w:sz w:val="20"/>
-                <w:szCs w:val="20"/>
-              </w:rPr>
-              <w:t xml:space="preserve"> um herauszufinden was verlangt wird oder </w:t>
-            </w:r>
-            <w:r>
-              <w:rPr>
-                <w:sz w:val="20"/>
-                <w:szCs w:val="20"/>
-              </w:rPr>
-              <w:t xml:space="preserve">die Frage so ausführlich wie möglich zu beantworten. </w:t>
-            </w:r>
-            <w:proofErr w:type="gramStart"/>
-            <w:r>
-              <w:rPr>
-                <w:sz w:val="20"/>
-                <w:szCs w:val="20"/>
-              </w:rPr>
-              <w:t>Finde</w:t>
-            </w:r>
-            <w:proofErr w:type="gramEnd"/>
-            <w:r>
-              <w:rPr>
-                <w:sz w:val="20"/>
-                <w:szCs w:val="20"/>
-              </w:rPr>
-              <w:t xml:space="preserve"> beide Ansätze kosten mir sehr viel Zeit</w:t>
+              <w:t xml:space="preserve"> den Zeitplan einhole. Bei einigen Fragen bleibe ich zu lange dran um herauszufinden was verlangt wird oder </w:t>
+            </w:r>
+            <w:r>
+              <w:rPr>
+                <w:sz w:val="20"/>
+                <w:szCs w:val="20"/>
+              </w:rPr>
+              <w:t>die Frage so ausführlich wie möglich zu beantworten. Finde beide Ansätze kosten mir sehr viel Zeit</w:t>
             </w:r>
           </w:p>
         </w:tc>
@@ -15444,21 +15280,12 @@
                 <w:szCs w:val="20"/>
               </w:rPr>
             </w:pPr>
-            <w:proofErr w:type="gramStart"/>
-            <w:r>
-              <w:rPr>
-                <w:sz w:val="20"/>
-                <w:szCs w:val="20"/>
-              </w:rPr>
-              <w:t>Befinde</w:t>
-            </w:r>
-            <w:proofErr w:type="gramEnd"/>
-            <w:r>
-              <w:rPr>
-                <w:sz w:val="20"/>
-                <w:szCs w:val="20"/>
-              </w:rPr>
-              <w:t xml:space="preserve"> mich im Abschnitt Planen unter Diagramme und Datenbanken. Laut dem Zeitplan für am 12.10.2026 sollte ich mich im Abschnitt Realisieren befinden und an den Pflanzen Endpunkten arbeiten. </w:t>
+            <w:r>
+              <w:rPr>
+                <w:sz w:val="20"/>
+                <w:szCs w:val="20"/>
+              </w:rPr>
+              <w:t xml:space="preserve">Befinde mich im Abschnitt Planen unter Diagramme und Datenbanken. Laut dem Zeitplan für am 12.10.2026 sollte ich mich im Abschnitt Realisieren befinden und an den Pflanzen Endpunkten arbeiten. </w:t>
             </w:r>
           </w:p>
         </w:tc>
@@ -15503,55 +15330,7 @@
                 <w:sz w:val="20"/>
                 <w:szCs w:val="20"/>
               </w:rPr>
-              <w:t xml:space="preserve">Heute befasste ich mich </w:t>
-            </w:r>
-            <w:proofErr w:type="gramStart"/>
-            <w:r>
-              <w:rPr>
-                <w:sz w:val="20"/>
-                <w:szCs w:val="20"/>
-              </w:rPr>
-              <w:t>viel</w:t>
-            </w:r>
-            <w:proofErr w:type="gramEnd"/>
-            <w:r>
-              <w:rPr>
-                <w:sz w:val="20"/>
-                <w:szCs w:val="20"/>
-              </w:rPr>
-              <w:t xml:space="preserve"> wie man Use-Case Diagramme erstellt und deren Logik. Um zu </w:t>
-            </w:r>
-            <w:proofErr w:type="gramStart"/>
-            <w:r>
-              <w:rPr>
-                <w:sz w:val="20"/>
-                <w:szCs w:val="20"/>
-              </w:rPr>
-              <w:t>verstehen</w:t>
-            </w:r>
-            <w:proofErr w:type="gramEnd"/>
-            <w:r>
-              <w:rPr>
-                <w:sz w:val="20"/>
-                <w:szCs w:val="20"/>
-              </w:rPr>
-              <w:t xml:space="preserve"> was alles ins Use-Case Diagramm gehört, habe ich meine Aufgabenstellung und meine bisherige Dokumentation nochmals durchgelesen und mit der KI versucht einen groben Überblick zu verschaffen welche Inhalte ich benötige. Die Kernfeature habe ich nochmals </w:t>
-            </w:r>
-            <w:proofErr w:type="gramStart"/>
-            <w:r>
-              <w:rPr>
-                <w:sz w:val="20"/>
-                <w:szCs w:val="20"/>
-              </w:rPr>
-              <w:t>überarbeitet</w:t>
-            </w:r>
-            <w:proofErr w:type="gramEnd"/>
-            <w:r>
-              <w:rPr>
-                <w:sz w:val="20"/>
-                <w:szCs w:val="20"/>
-              </w:rPr>
-              <w:t xml:space="preserve"> weil zu viel Text vorhanden war, habe es simpler umschrieben.</w:t>
+              <w:t>Heute befasste ich mich viel wie man Use-Case Diagramme erstellt und deren Logik. Um zu verstehen was alles ins Use-Case Diagramm gehört, habe ich meine Aufgabenstellung und meine bisherige Dokumentation nochmals durchgelesen und mit der KI versucht einen groben Überblick zu verschaffen welche Inhalte ich benötige. Die Kernfeature habe ich nochmals überarbeitet weil zu viel Text vorhanden war, habe es simpler umschrieben.</w:t>
             </w:r>
           </w:p>
         </w:tc>
@@ -16123,37 +15902,12 @@
                 <w:szCs w:val="20"/>
               </w:rPr>
             </w:pPr>
-            <w:proofErr w:type="gramStart"/>
-            <w:r>
-              <w:rPr>
-                <w:sz w:val="20"/>
-                <w:szCs w:val="20"/>
-              </w:rPr>
-              <w:t>Habe</w:t>
-            </w:r>
-            <w:proofErr w:type="gramEnd"/>
-            <w:r>
-              <w:rPr>
-                <w:sz w:val="20"/>
-                <w:szCs w:val="20"/>
-              </w:rPr>
-              <w:t xml:space="preserve"> am Kapitel Planen gearbeitet, an den Kernfeatures und Testkonzept. Kernfeatures habe ich fertiggestellt und beim Testkonzept fehlen mir nur noch zwei Abschnitte. Heute konnte ich gut arbeiten und hatte einen guten Fokus. </w:t>
-            </w:r>
-            <w:proofErr w:type="gramStart"/>
-            <w:r>
-              <w:rPr>
-                <w:sz w:val="20"/>
-                <w:szCs w:val="20"/>
-              </w:rPr>
-              <w:t>Habe</w:t>
-            </w:r>
-            <w:proofErr w:type="gramEnd"/>
-            <w:r>
-              <w:rPr>
-                <w:sz w:val="20"/>
-                <w:szCs w:val="20"/>
-              </w:rPr>
-              <w:t xml:space="preserve"> vieles sehr schnell verstanden. </w:t>
+            <w:r>
+              <w:rPr>
+                <w:sz w:val="20"/>
+                <w:szCs w:val="20"/>
+              </w:rPr>
+              <w:t xml:space="preserve">Habe am Kapitel Planen gearbeitet, an den Kernfeatures und Testkonzept. Kernfeatures habe ich fertiggestellt und beim Testkonzept fehlen mir nur noch zwei Abschnitte. Heute konnte ich gut arbeiten und hatte einen guten Fokus. Habe vieles sehr schnell verstanden. </w:t>
             </w:r>
           </w:p>
         </w:tc>
@@ -16707,87 +16461,7 @@
                 <w:sz w:val="20"/>
                 <w:szCs w:val="20"/>
               </w:rPr>
-              <w:t xml:space="preserve">Heute habe ich das Planen und Entscheiden Kapitel abgeschlossen und habe mit dem Realisieren begonnen. Beim Realisieren befinde ich mich am Anfang. Ich habe eine Abbildung des </w:t>
-            </w:r>
-            <w:proofErr w:type="gramStart"/>
-            <w:r>
-              <w:rPr>
-                <w:sz w:val="20"/>
-                <w:szCs w:val="20"/>
-              </w:rPr>
-              <w:t>Systems erstellt</w:t>
-            </w:r>
-            <w:proofErr w:type="gramEnd"/>
-            <w:r>
-              <w:rPr>
-                <w:sz w:val="20"/>
-                <w:szCs w:val="20"/>
-              </w:rPr>
-              <w:t xml:space="preserve"> welches mir helfen </w:t>
-            </w:r>
-            <w:proofErr w:type="gramStart"/>
-            <w:r>
-              <w:rPr>
-                <w:sz w:val="20"/>
-                <w:szCs w:val="20"/>
-              </w:rPr>
-              <w:t>sollte</w:t>
-            </w:r>
-            <w:proofErr w:type="gramEnd"/>
-            <w:r>
-              <w:rPr>
-                <w:sz w:val="20"/>
-                <w:szCs w:val="20"/>
-              </w:rPr>
-              <w:t xml:space="preserve"> eine Veranschaulichung zu </w:t>
-            </w:r>
-            <w:proofErr w:type="gramStart"/>
-            <w:r>
-              <w:rPr>
-                <w:sz w:val="20"/>
-                <w:szCs w:val="20"/>
-              </w:rPr>
-              <w:t>haben</w:t>
-            </w:r>
-            <w:proofErr w:type="gramEnd"/>
-            <w:r>
-              <w:rPr>
-                <w:sz w:val="20"/>
-                <w:szCs w:val="20"/>
-              </w:rPr>
-              <w:t xml:space="preserve"> wenn ich später mal </w:t>
-            </w:r>
-            <w:proofErr w:type="gramStart"/>
-            <w:r>
-              <w:rPr>
-                <w:sz w:val="20"/>
-                <w:szCs w:val="20"/>
-              </w:rPr>
-              <w:t>diese Dokument</w:t>
-            </w:r>
-            <w:proofErr w:type="gramEnd"/>
-            <w:r>
-              <w:rPr>
-                <w:sz w:val="20"/>
-                <w:szCs w:val="20"/>
-              </w:rPr>
-              <w:t xml:space="preserve"> öffne welches mir dann sofort </w:t>
-            </w:r>
-            <w:proofErr w:type="gramStart"/>
-            <w:r>
-              <w:rPr>
-                <w:sz w:val="20"/>
-                <w:szCs w:val="20"/>
-              </w:rPr>
-              <w:t>zeigt</w:t>
-            </w:r>
-            <w:proofErr w:type="gramEnd"/>
-            <w:r>
-              <w:rPr>
-                <w:sz w:val="20"/>
-                <w:szCs w:val="20"/>
-              </w:rPr>
-              <w:t xml:space="preserve"> wie das Projekt aufgebaut ist.  </w:t>
+              <w:t xml:space="preserve">Heute habe ich das Planen und Entscheiden Kapitel abgeschlossen und habe mit dem Realisieren begonnen. Beim Realisieren befinde ich mich am Anfang. Ich habe eine Abbildung des Systems erstellt welches mir helfen sollte eine Veranschaulichung zu haben wenn ich später mal diese Dokument öffne welches mir dann sofort zeigt wie das Projekt aufgebaut ist.  </w:t>
             </w:r>
             <w:r>
               <w:rPr>
@@ -16933,6 +16607,13 @@
                 <w:szCs w:val="20"/>
               </w:rPr>
             </w:pPr>
+            <w:r>
+              <w:rPr>
+                <w:sz w:val="20"/>
+                <w:szCs w:val="20"/>
+              </w:rPr>
+              <w:t xml:space="preserve">Endpunkte Giessen, Endpunkte Kategorie </w:t>
+            </w:r>
           </w:p>
         </w:tc>
       </w:tr>
@@ -17068,6 +16749,13 @@
                 <w:szCs w:val="20"/>
               </w:rPr>
             </w:pPr>
+            <w:r>
+              <w:rPr>
+                <w:sz w:val="20"/>
+                <w:szCs w:val="20"/>
+              </w:rPr>
+              <w:t xml:space="preserve">Das erstellen der Grundstruktur der Pflanzen Endpunkte. </w:t>
+            </w:r>
           </w:p>
         </w:tc>
       </w:tr>
@@ -17105,6 +16793,13 @@
                 <w:szCs w:val="20"/>
               </w:rPr>
             </w:pPr>
+            <w:r>
+              <w:rPr>
+                <w:sz w:val="20"/>
+                <w:szCs w:val="20"/>
+              </w:rPr>
+              <w:t>-</w:t>
+            </w:r>
           </w:p>
         </w:tc>
       </w:tr>
@@ -17142,6 +16837,13 @@
                 <w:szCs w:val="20"/>
               </w:rPr>
             </w:pPr>
+            <w:r>
+              <w:rPr>
+                <w:sz w:val="20"/>
+                <w:szCs w:val="20"/>
+              </w:rPr>
+              <w:t>-</w:t>
+            </w:r>
           </w:p>
         </w:tc>
       </w:tr>
@@ -17942,23 +17644,7 @@
           <w:sz w:val="20"/>
           <w:szCs w:val="20"/>
         </w:rPr>
-        <w:t xml:space="preserve"> benötigt, </w:t>
-      </w:r>
-      <w:proofErr w:type="gramStart"/>
-      <w:r>
-        <w:rPr>
-          <w:sz w:val="20"/>
-          <w:szCs w:val="20"/>
-        </w:rPr>
-        <w:t>mit der Pflanzen</w:t>
-      </w:r>
-      <w:proofErr w:type="gramEnd"/>
-      <w:r>
-        <w:rPr>
-          <w:sz w:val="20"/>
-          <w:szCs w:val="20"/>
-        </w:rPr>
-        <w:t xml:space="preserve"> und ihre Pflegeinformationen gespeichert und verwaltet werden können. </w:t>
+        <w:t xml:space="preserve"> benötigt, mit der Pflanzen und ihre Pflegeinformationen gespeichert und verwaltet werden können. </w:t>
       </w:r>
       <w:r>
         <w:rPr>
@@ -17972,23 +17658,7 @@
           <w:sz w:val="20"/>
           <w:szCs w:val="20"/>
         </w:rPr>
-        <w:t xml:space="preserve"> Deshalb soll ein API-Backend entwickelt werden, </w:t>
-      </w:r>
-      <w:proofErr w:type="gramStart"/>
-      <w:r>
-        <w:rPr>
-          <w:sz w:val="20"/>
-          <w:szCs w:val="20"/>
-        </w:rPr>
-        <w:t>das</w:t>
-      </w:r>
-      <w:proofErr w:type="gramEnd"/>
-      <w:r>
-        <w:rPr>
-          <w:sz w:val="20"/>
-          <w:szCs w:val="20"/>
-        </w:rPr>
-        <w:t xml:space="preserve"> die Datenverwaltung übernimmt und die benötigten Funktionen für ein zukünftiges Frontend bereitstellt.</w:t>
+        <w:t xml:space="preserve"> Deshalb soll ein API-Backend entwickelt werden, das die Datenverwaltung übernimmt und die benötigten Funktionen für ein zukünftiges Frontend bereitstellt.</w:t>
       </w:r>
     </w:p>
     <w:p>
@@ -18190,15 +17860,7 @@
           <w:sz w:val="20"/>
           <w:szCs w:val="20"/>
         </w:rPr>
-        <w:t xml:space="preserve">Welche Funktionen und welches Ergebnis werden </w:t>
-      </w:r>
-      <w:proofErr w:type="gramStart"/>
-      <w:r>
-        <w:rPr>
-          <w:sz w:val="20"/>
-          <w:szCs w:val="20"/>
-        </w:rPr>
-        <w:t>verlangt?</w:t>
+        <w:t>Welche Funktionen und welches Ergebnis werden verlangt?</w:t>
       </w:r>
       <w:r>
         <w:rPr>
@@ -18207,7 +17869,6 @@
         </w:rPr>
         <w:t>:</w:t>
       </w:r>
-      <w:proofErr w:type="gramEnd"/>
       <w:r>
         <w:rPr>
           <w:sz w:val="20"/>
@@ -18259,15 +17920,7 @@
           <w:sz w:val="20"/>
           <w:szCs w:val="20"/>
         </w:rPr>
-        <w:t xml:space="preserve">Welche Technologien und technischen Vorgaben müssen bei der Umsetzung eingehalten </w:t>
-      </w:r>
-      <w:proofErr w:type="gramStart"/>
-      <w:r>
-        <w:rPr>
-          <w:sz w:val="20"/>
-          <w:szCs w:val="20"/>
-        </w:rPr>
-        <w:t>werden?</w:t>
+        <w:t>Welche Technologien und technischen Vorgaben müssen bei der Umsetzung eingehalten werden?</w:t>
       </w:r>
       <w:r>
         <w:rPr>
@@ -18276,7 +17929,6 @@
         </w:rPr>
         <w:t>:</w:t>
       </w:r>
-      <w:proofErr w:type="gramEnd"/>
     </w:p>
     <w:p>
       <w:pPr>
@@ -20242,23 +19894,7 @@
                 <w:sz w:val="20"/>
                 <w:szCs w:val="20"/>
               </w:rPr>
-              <w:t xml:space="preserve">Die Datenbank enthält eine Tabelle für Kategorien </w:t>
-            </w:r>
-            <w:proofErr w:type="gramStart"/>
-            <w:r>
-              <w:rPr>
-                <w:sz w:val="20"/>
-                <w:szCs w:val="20"/>
-              </w:rPr>
-              <w:t>mit Name</w:t>
-            </w:r>
-            <w:proofErr w:type="gramEnd"/>
-            <w:r>
-              <w:rPr>
-                <w:sz w:val="20"/>
-                <w:szCs w:val="20"/>
-              </w:rPr>
-              <w:t xml:space="preserve"> und Beschreibung.</w:t>
+              <w:t>Die Datenbank enthält eine Tabelle für Kategorien mit Name und Beschreibung.</w:t>
             </w:r>
           </w:p>
         </w:tc>
@@ -20469,23 +20105,7 @@
                 <w:sz w:val="20"/>
                 <w:szCs w:val="20"/>
               </w:rPr>
-              <w:t xml:space="preserve">Die Datenbank enthält eine Tabelle für Pflanzen </w:t>
-            </w:r>
-            <w:proofErr w:type="gramStart"/>
-            <w:r>
-              <w:rPr>
-                <w:sz w:val="20"/>
-                <w:szCs w:val="20"/>
-              </w:rPr>
-              <w:t>mit Name</w:t>
-            </w:r>
-            <w:proofErr w:type="gramEnd"/>
-            <w:r>
-              <w:rPr>
-                <w:sz w:val="20"/>
-                <w:szCs w:val="20"/>
-              </w:rPr>
-              <w:t>, Substrat, Standort/Licht, Bemerkungen und Erstelldatum.</w:t>
+              <w:t>Die Datenbank enthält eine Tabelle für Pflanzen mit Name, Substrat, Standort/Licht, Bemerkungen und Erstelldatum.</w:t>
             </w:r>
           </w:p>
         </w:tc>
@@ -20935,23 +20555,7 @@
                 <w:sz w:val="20"/>
                 <w:szCs w:val="20"/>
               </w:rPr>
-              <w:t xml:space="preserve">Die Pflanzen können </w:t>
-            </w:r>
-            <w:proofErr w:type="gramStart"/>
-            <w:r>
-              <w:rPr>
-                <w:sz w:val="20"/>
-                <w:szCs w:val="20"/>
-              </w:rPr>
-              <w:t>nach Name</w:t>
-            </w:r>
-            <w:proofErr w:type="gramEnd"/>
-            <w:r>
-              <w:rPr>
-                <w:sz w:val="20"/>
-                <w:szCs w:val="20"/>
-              </w:rPr>
-              <w:t>, Kategorie, Substrat, Giessen und Standort gefiltert werden.</w:t>
+              <w:t>Die Pflanzen können nach Name, Kategorie, Substrat, Giessen und Standort gefiltert werden.</w:t>
             </w:r>
             <w:r>
               <w:rPr>
@@ -21214,23 +20818,7 @@
                 <w:sz w:val="20"/>
                 <w:szCs w:val="20"/>
               </w:rPr>
-              <w:t xml:space="preserve">Eine Pflanze kann </w:t>
-            </w:r>
-            <w:proofErr w:type="gramStart"/>
-            <w:r>
-              <w:rPr>
-                <w:sz w:val="20"/>
-                <w:szCs w:val="20"/>
-              </w:rPr>
-              <w:t>mit Name</w:t>
-            </w:r>
-            <w:proofErr w:type="gramEnd"/>
-            <w:r>
-              <w:rPr>
-                <w:sz w:val="20"/>
-                <w:szCs w:val="20"/>
-              </w:rPr>
-              <w:t>, Substrat, Standort/Licht und Bemerkungen sowie einer Kategorie und einem Giesseintrag erstellt werden</w:t>
+              <w:t>Eine Pflanze kann mit Name, Substrat, Standort/Licht und Bemerkungen sowie einer Kategorie und einem Giesseintrag erstellt werden</w:t>
             </w:r>
             <w:r>
               <w:rPr>
@@ -23963,23 +23551,7 @@
           <w:sz w:val="20"/>
           <w:szCs w:val="20"/>
         </w:rPr>
-        <w:t xml:space="preserve">wie Datensicherheit und Versionierung sichergestellt </w:t>
-      </w:r>
-      <w:proofErr w:type="gramStart"/>
-      <w:r>
-        <w:rPr>
-          <w:sz w:val="20"/>
-          <w:szCs w:val="20"/>
-        </w:rPr>
-        <w:t>wird</w:t>
-      </w:r>
-      <w:proofErr w:type="gramEnd"/>
-      <w:r>
-        <w:rPr>
-          <w:sz w:val="20"/>
-          <w:szCs w:val="20"/>
-        </w:rPr>
-        <w:t xml:space="preserve">. </w:t>
+        <w:t xml:space="preserve">wie Datensicherheit und Versionierung sichergestellt wird. </w:t>
       </w:r>
     </w:p>
     <w:p>
@@ -26359,15 +25931,7 @@
                 <w:sz w:val="20"/>
                 <w:szCs w:val="20"/>
               </w:rPr>
-              <w:t xml:space="preserve">Zugangsdaten werden in </w:t>
-            </w:r>
-            <w:proofErr w:type="gramStart"/>
-            <w:r>
-              <w:rPr>
-                <w:sz w:val="20"/>
-                <w:szCs w:val="20"/>
-              </w:rPr>
-              <w:t>einer .</w:t>
+              <w:t>Zugangsdaten werden in einer .</w:t>
             </w:r>
             <w:proofErr w:type="spellStart"/>
             <w:r>
@@ -26378,21 +25942,12 @@
               <w:t>env</w:t>
             </w:r>
             <w:proofErr w:type="spellEnd"/>
-            <w:proofErr w:type="gramEnd"/>
-            <w:r>
-              <w:rPr>
-                <w:sz w:val="20"/>
-                <w:szCs w:val="20"/>
-              </w:rPr>
-              <w:t xml:space="preserve">-Datei gespeichert, die </w:t>
-            </w:r>
-            <w:proofErr w:type="gramStart"/>
-            <w:r>
-              <w:rPr>
-                <w:sz w:val="20"/>
-                <w:szCs w:val="20"/>
-              </w:rPr>
-              <w:t>über .</w:t>
+            <w:r>
+              <w:rPr>
+                <w:sz w:val="20"/>
+                <w:szCs w:val="20"/>
+              </w:rPr>
+              <w:t>-Datei gespeichert, die über .</w:t>
             </w:r>
             <w:proofErr w:type="spellStart"/>
             <w:r>
@@ -26403,7 +25958,6 @@
               <w:t>gitignore</w:t>
             </w:r>
             <w:proofErr w:type="spellEnd"/>
-            <w:proofErr w:type="gramEnd"/>
             <w:r>
               <w:rPr>
                 <w:sz w:val="20"/>
@@ -27969,15 +27523,7 @@
               <w:cnfStyle w:val="000000000000" w:firstRow="0" w:lastRow="0" w:firstColumn="0" w:lastColumn="0" w:oddVBand="0" w:evenVBand="0" w:oddHBand="0" w:evenHBand="0" w:firstRowFirstColumn="0" w:firstRowLastColumn="0" w:lastRowFirstColumn="0" w:lastRowLastColumn="0"/>
             </w:pPr>
             <w:r>
-              <w:t xml:space="preserve">Pflanzen </w:t>
-            </w:r>
-            <w:proofErr w:type="gramStart"/>
-            <w:r>
-              <w:t>nach Name</w:t>
-            </w:r>
-            <w:proofErr w:type="gramEnd"/>
-            <w:r>
-              <w:t>, Kategorie, Substrat, Giessen und Standort filtern sowie nach Erstelldatum auf- oder absteigend sortieren.</w:t>
+              <w:t>Pflanzen nach Name, Kategorie, Substrat, Giessen und Standort filtern sowie nach Erstelldatum auf- oder absteigend sortieren.</w:t>
             </w:r>
           </w:p>
         </w:tc>
@@ -29138,12 +28684,10 @@
         <w:t xml:space="preserve">In einem Terminal im Backend-Projektordner wird der konfigurierte Startbefehl ausgeführt. Wenn in der </w:t>
       </w:r>
       <w:proofErr w:type="spellStart"/>
-      <w:proofErr w:type="gramStart"/>
       <w:r>
         <w:t>package.json</w:t>
       </w:r>
       <w:proofErr w:type="spellEnd"/>
-      <w:proofErr w:type="gramEnd"/>
       <w:r>
         <w:t xml:space="preserve"> ein </w:t>
       </w:r>
@@ -29443,21 +28987,8 @@
       </w:r>
     </w:p>
     <w:p>
-      <w:proofErr w:type="gramStart"/>
-      <w:r>
-        <w:t>Aspekte</w:t>
-      </w:r>
-      <w:proofErr w:type="gramEnd"/>
-      <w:r>
-        <w:t xml:space="preserve"> welche nicht getestet </w:t>
-      </w:r>
-      <w:proofErr w:type="gramStart"/>
-      <w:r>
-        <w:t>werden</w:t>
-      </w:r>
-      <w:proofErr w:type="gramEnd"/>
-      <w:r>
-        <w:t xml:space="preserve"> sind die Veröffentlichung der Anwe</w:t>
+      <w:r>
+        <w:t>Aspekte welche nicht getestet werden sind die Veröffentlichung der Anwe</w:t>
       </w:r>
       <w:r>
         <w:t xml:space="preserve">ndung, es lauft nur lokal, eine Benutzerverwaltung, diese Anforderung ist nicht vorhanden, zuletzt Last- und Performancetests, weil diese auch nicht zu den Anforderungen gehören. </w:t>
@@ -29779,15 +29310,7 @@
             </w:r>
             <w:proofErr w:type="spellEnd"/>
             <w:r>
-              <w:t xml:space="preserve">/pflanzen </w:t>
-            </w:r>
-            <w:proofErr w:type="gramStart"/>
-            <w:r>
-              <w:t>mit Name</w:t>
-            </w:r>
-            <w:proofErr w:type="gramEnd"/>
-            <w:r>
-              <w:t xml:space="preserve"> «Monstera», Substrat «Kokoserde», Standort «Halbschatten», Bemerkungen, </w:t>
+              <w:t xml:space="preserve">/pflanzen mit Name «Monstera», Substrat «Kokoserde», Standort «Halbschatten», Bemerkungen, </w:t>
             </w:r>
             <w:proofErr w:type="spellStart"/>
             <w:r>
@@ -30122,15 +29645,7 @@
             </w:r>
             <w:proofErr w:type="spellEnd"/>
             <w:r>
-              <w:t xml:space="preserve"> </w:t>
-            </w:r>
-            <w:proofErr w:type="gramStart"/>
-            <w:r>
-              <w:t>mit Name</w:t>
-            </w:r>
-            <w:proofErr w:type="gramEnd"/>
-            <w:r>
-              <w:t xml:space="preserve"> «Kaktus», Beschreibung</w:t>
+              <w:t xml:space="preserve"> mit Name «Kaktus», Beschreibung</w:t>
             </w:r>
           </w:p>
         </w:tc>
@@ -31055,13 +30570,8 @@
             </w:r>
             <w:proofErr w:type="spellEnd"/>
             <w:r>
-              <w:t xml:space="preserve">/pflanzen </w:t>
-            </w:r>
-            <w:proofErr w:type="gramStart"/>
-            <w:r>
-              <w:t>ohne Name</w:t>
-            </w:r>
-            <w:proofErr w:type="gramEnd"/>
+              <w:t>/pflanzen ohne Name</w:t>
+            </w:r>
           </w:p>
         </w:tc>
         <w:tc>
@@ -31662,13 +31172,8 @@
               <w:spacing w:line="300" w:lineRule="atLeast"/>
               <w:cnfStyle w:val="000000100000" w:firstRow="0" w:lastRow="0" w:firstColumn="0" w:lastColumn="0" w:oddVBand="0" w:evenVBand="0" w:oddHBand="1" w:evenHBand="0" w:firstRowFirstColumn="0" w:firstRowLastColumn="0" w:lastRowFirstColumn="0" w:lastRowLastColumn="0"/>
             </w:pPr>
-            <w:proofErr w:type="gramStart"/>
-            <w:r>
-              <w:t>Nach Name</w:t>
-            </w:r>
-            <w:proofErr w:type="gramEnd"/>
-            <w:r>
-              <w:t xml:space="preserve"> filtern </w:t>
+            <w:r>
+              <w:t xml:space="preserve">Nach Name filtern </w:t>
             </w:r>
           </w:p>
         </w:tc>
@@ -32480,15 +31985,7 @@
             </w:r>
             <w:proofErr w:type="spellEnd"/>
             <w:r>
-              <w:t xml:space="preserve"> </w:t>
-            </w:r>
-            <w:proofErr w:type="gramStart"/>
-            <w:r>
-              <w:t>mit Name</w:t>
-            </w:r>
-            <w:proofErr w:type="gramEnd"/>
-            <w:r>
-              <w:t xml:space="preserve"> «Zimmerpflanze»</w:t>
+              <w:t xml:space="preserve"> mit Name «Zimmerpflanze»</w:t>
             </w:r>
           </w:p>
         </w:tc>
@@ -32601,13 +32098,8 @@
             </w:r>
             <w:proofErr w:type="spellEnd"/>
             <w:r>
-              <w:t xml:space="preserve"> </w:t>
-            </w:r>
-            <w:proofErr w:type="gramStart"/>
-            <w:r>
-              <w:t>ohne Name</w:t>
-            </w:r>
-            <w:proofErr w:type="gramEnd"/>
+              <w:t xml:space="preserve"> ohne Name</w:t>
+            </w:r>
           </w:p>
         </w:tc>
         <w:tc>
@@ -32706,15 +32198,7 @@
             </w:r>
             <w:proofErr w:type="spellEnd"/>
             <w:r>
-              <w:t xml:space="preserve">/1 </w:t>
-            </w:r>
-            <w:proofErr w:type="gramStart"/>
-            <w:r>
-              <w:t>mit Name</w:t>
-            </w:r>
-            <w:proofErr w:type="gramEnd"/>
-            <w:r>
-              <w:t xml:space="preserve"> «Kaktus»</w:t>
+              <w:t>/1 mit Name «Kaktus»</w:t>
             </w:r>
           </w:p>
         </w:tc>
@@ -33912,7 +33396,6 @@
         <w:t xml:space="preserve"> mit </w:t>
       </w:r>
       <w:proofErr w:type="spellStart"/>
-      <w:proofErr w:type="gramStart"/>
       <w:r>
         <w:rPr>
           <w:rFonts w:asciiTheme="majorHAnsi" w:eastAsiaTheme="majorEastAsia" w:hAnsiTheme="majorHAnsi" w:cstheme="majorBidi"/>
@@ -33930,9 +33413,9 @@
           <w:spacing w:val="-10"/>
           <w:kern w:val="28"/>
         </w:rPr>
-        <w:t>(</w:t>
-      </w:r>
-      <w:proofErr w:type="gramEnd"/>
+        <w:t xml:space="preserve">() und </w:t>
+      </w:r>
+      <w:proofErr w:type="spellStart"/>
       <w:r>
         <w:rPr>
           <w:rFonts w:asciiTheme="majorHAnsi" w:eastAsiaTheme="majorEastAsia" w:hAnsiTheme="majorHAnsi" w:cstheme="majorBidi"/>
@@ -33940,10 +33423,9 @@
           <w:spacing w:val="-10"/>
           <w:kern w:val="28"/>
         </w:rPr>
-        <w:t xml:space="preserve">) und </w:t>
-      </w:r>
-      <w:proofErr w:type="spellStart"/>
-      <w:proofErr w:type="gramStart"/>
+        <w:t>module.exports</w:t>
+      </w:r>
+      <w:proofErr w:type="spellEnd"/>
       <w:r>
         <w:rPr>
           <w:rFonts w:asciiTheme="majorHAnsi" w:eastAsiaTheme="majorEastAsia" w:hAnsiTheme="majorHAnsi" w:cstheme="majorBidi"/>
@@ -33951,10 +33433,9 @@
           <w:spacing w:val="-10"/>
           <w:kern w:val="28"/>
         </w:rPr>
-        <w:t>module.exports</w:t>
-      </w:r>
-      <w:proofErr w:type="spellEnd"/>
-      <w:proofErr w:type="gramEnd"/>
+        <w:t xml:space="preserve"> sowie </w:t>
+      </w:r>
+      <w:proofErr w:type="spellStart"/>
       <w:r>
         <w:rPr>
           <w:rFonts w:asciiTheme="majorHAnsi" w:eastAsiaTheme="majorEastAsia" w:hAnsiTheme="majorHAnsi" w:cstheme="majorBidi"/>
@@ -33962,9 +33443,9 @@
           <w:spacing w:val="-10"/>
           <w:kern w:val="28"/>
         </w:rPr>
-        <w:t xml:space="preserve"> sowie </w:t>
-      </w:r>
-      <w:proofErr w:type="spellStart"/>
+        <w:t>ECMAScript</w:t>
+      </w:r>
+      <w:proofErr w:type="spellEnd"/>
       <w:r>
         <w:rPr>
           <w:rFonts w:asciiTheme="majorHAnsi" w:eastAsiaTheme="majorEastAsia" w:hAnsiTheme="majorHAnsi" w:cstheme="majorBidi"/>
@@ -33972,9 +33453,9 @@
           <w:spacing w:val="-10"/>
           <w:kern w:val="28"/>
         </w:rPr>
-        <w:t>ECMAScript</w:t>
-      </w:r>
-      <w:proofErr w:type="spellEnd"/>
+        <w:t xml:space="preserve"> Modules (ES Modules) mit </w:t>
+      </w:r>
+      <w:proofErr w:type="spellStart"/>
       <w:r>
         <w:rPr>
           <w:rFonts w:asciiTheme="majorHAnsi" w:eastAsiaTheme="majorEastAsia" w:hAnsiTheme="majorHAnsi" w:cstheme="majorBidi"/>
@@ -33982,9 +33463,9 @@
           <w:spacing w:val="-10"/>
           <w:kern w:val="28"/>
         </w:rPr>
-        <w:t xml:space="preserve"> Modules (ES Modules) mit </w:t>
-      </w:r>
-      <w:proofErr w:type="spellStart"/>
+        <w:t>import</w:t>
+      </w:r>
+      <w:proofErr w:type="spellEnd"/>
       <w:r>
         <w:rPr>
           <w:rFonts w:asciiTheme="majorHAnsi" w:eastAsiaTheme="majorEastAsia" w:hAnsiTheme="majorHAnsi" w:cstheme="majorBidi"/>
@@ -33992,9 +33473,9 @@
           <w:spacing w:val="-10"/>
           <w:kern w:val="28"/>
         </w:rPr>
-        <w:t>import</w:t>
-      </w:r>
-      <w:proofErr w:type="spellEnd"/>
+        <w:t xml:space="preserve"> und </w:t>
+      </w:r>
+      <w:proofErr w:type="spellStart"/>
       <w:r>
         <w:rPr>
           <w:rFonts w:asciiTheme="majorHAnsi" w:eastAsiaTheme="majorEastAsia" w:hAnsiTheme="majorHAnsi" w:cstheme="majorBidi"/>
@@ -34002,9 +33483,9 @@
           <w:spacing w:val="-10"/>
           <w:kern w:val="28"/>
         </w:rPr>
-        <w:t xml:space="preserve"> und </w:t>
-      </w:r>
-      <w:proofErr w:type="spellStart"/>
+        <w:t>export</w:t>
+      </w:r>
+      <w:proofErr w:type="spellEnd"/>
       <w:r>
         <w:rPr>
           <w:rFonts w:asciiTheme="majorHAnsi" w:eastAsiaTheme="majorEastAsia" w:hAnsiTheme="majorHAnsi" w:cstheme="majorBidi"/>
@@ -34012,18 +33493,18 @@
           <w:spacing w:val="-10"/>
           <w:kern w:val="28"/>
         </w:rPr>
-        <w:t>export</w:t>
-      </w:r>
-      <w:proofErr w:type="spellEnd"/>
-      <w:r>
+        <w:t>. ES Modules sind das offizielle Standardformat von JavaScript, um Code in wiederverwendbare Module aufzuteilen.</w:t>
+      </w:r>
+    </w:p>
+    <w:p>
+      <w:pPr>
         <w:rPr>
           <w:rFonts w:asciiTheme="majorHAnsi" w:eastAsiaTheme="majorEastAsia" w:hAnsiTheme="majorHAnsi" w:cstheme="majorBidi"/>
           <w:bCs/>
           <w:spacing w:val="-10"/>
           <w:kern w:val="28"/>
         </w:rPr>
-        <w:t>. ES Modules sind das offizielle Standardformat von JavaScript, um Code in wiederverwendbare Module aufzuteilen.</w:t>
-      </w:r>
+      </w:pPr>
     </w:p>
     <w:p>
       <w:pPr>
@@ -34034,16 +33515,16 @@
           <w:kern w:val="28"/>
         </w:rPr>
       </w:pPr>
-    </w:p>
-    <w:p>
-      <w:pPr>
+      <w:r>
         <w:rPr>
           <w:rFonts w:asciiTheme="majorHAnsi" w:eastAsiaTheme="majorEastAsia" w:hAnsiTheme="majorHAnsi" w:cstheme="majorBidi"/>
           <w:bCs/>
           <w:spacing w:val="-10"/>
           <w:kern w:val="28"/>
         </w:rPr>
-      </w:pPr>
+        <w:t>Für dieses Projekt werden ES Modules verwendet. Aktiviert werden sie über den Eintrag "type": "</w:t>
+      </w:r>
+      <w:proofErr w:type="spellStart"/>
       <w:r>
         <w:rPr>
           <w:rFonts w:asciiTheme="majorHAnsi" w:eastAsiaTheme="majorEastAsia" w:hAnsiTheme="majorHAnsi" w:cstheme="majorBidi"/>
@@ -34051,9 +33532,9 @@
           <w:spacing w:val="-10"/>
           <w:kern w:val="28"/>
         </w:rPr>
-        <w:t>Für dieses Projekt werden ES Modules verwendet. Aktiviert werden sie über den Eintrag "type": "</w:t>
-      </w:r>
-      <w:proofErr w:type="spellStart"/>
+        <w:t>module</w:t>
+      </w:r>
+      <w:proofErr w:type="spellEnd"/>
       <w:r>
         <w:rPr>
           <w:rFonts w:asciiTheme="majorHAnsi" w:eastAsiaTheme="majorEastAsia" w:hAnsiTheme="majorHAnsi" w:cstheme="majorBidi"/>
@@ -34061,9 +33542,9 @@
           <w:spacing w:val="-10"/>
           <w:kern w:val="28"/>
         </w:rPr>
-        <w:t>module</w:t>
-      </w:r>
-      <w:proofErr w:type="spellEnd"/>
+        <w:t xml:space="preserve">" in der </w:t>
+      </w:r>
+      <w:proofErr w:type="spellStart"/>
       <w:r>
         <w:rPr>
           <w:rFonts w:asciiTheme="majorHAnsi" w:eastAsiaTheme="majorEastAsia" w:hAnsiTheme="majorHAnsi" w:cstheme="majorBidi"/>
@@ -34071,10 +33552,9 @@
           <w:spacing w:val="-10"/>
           <w:kern w:val="28"/>
         </w:rPr>
-        <w:t xml:space="preserve">" in der </w:t>
-      </w:r>
-      <w:proofErr w:type="spellStart"/>
-      <w:proofErr w:type="gramStart"/>
+        <w:t>package.json</w:t>
+      </w:r>
+      <w:proofErr w:type="spellEnd"/>
       <w:r>
         <w:rPr>
           <w:rFonts w:asciiTheme="majorHAnsi" w:eastAsiaTheme="majorEastAsia" w:hAnsiTheme="majorHAnsi" w:cstheme="majorBidi"/>
@@ -34082,10 +33562,9 @@
           <w:spacing w:val="-10"/>
           <w:kern w:val="28"/>
         </w:rPr>
-        <w:t>package.json</w:t>
-      </w:r>
-      <w:proofErr w:type="spellEnd"/>
-      <w:proofErr w:type="gramEnd"/>
+        <w:t xml:space="preserve">. Express.js lässt sich trotzdem problemlos einbinden: Eine import-Anweisung kann sowohl ES Modules als auch </w:t>
+      </w:r>
+      <w:proofErr w:type="spellStart"/>
       <w:r>
         <w:rPr>
           <w:rFonts w:asciiTheme="majorHAnsi" w:eastAsiaTheme="majorEastAsia" w:hAnsiTheme="majorHAnsi" w:cstheme="majorBidi"/>
@@ -34093,9 +33572,9 @@
           <w:spacing w:val="-10"/>
           <w:kern w:val="28"/>
         </w:rPr>
-        <w:t xml:space="preserve">. Express.js lässt sich trotzdem problemlos einbinden: Eine import-Anweisung kann sowohl ES Modules als auch </w:t>
-      </w:r>
-      <w:proofErr w:type="spellStart"/>
+        <w:t>CommonJS</w:t>
+      </w:r>
+      <w:proofErr w:type="spellEnd"/>
       <w:r>
         <w:rPr>
           <w:rFonts w:asciiTheme="majorHAnsi" w:eastAsiaTheme="majorEastAsia" w:hAnsiTheme="majorHAnsi" w:cstheme="majorBidi"/>
@@ -34103,28 +33582,28 @@
           <w:spacing w:val="-10"/>
           <w:kern w:val="28"/>
         </w:rPr>
-        <w:t>CommonJS</w:t>
-      </w:r>
-      <w:proofErr w:type="spellEnd"/>
-      <w:r>
+        <w:t>-Module laden.</w:t>
+      </w:r>
+    </w:p>
+    <w:p>
+      <w:pPr>
         <w:rPr>
           <w:rFonts w:asciiTheme="majorHAnsi" w:eastAsiaTheme="majorEastAsia" w:hAnsiTheme="majorHAnsi" w:cstheme="majorBidi"/>
           <w:bCs/>
           <w:spacing w:val="-10"/>
           <w:kern w:val="28"/>
         </w:rPr>
-        <w:t>-Module laden.</w:t>
-      </w:r>
-    </w:p>
-    <w:p>
-      <w:pPr>
+      </w:pPr>
+      <w:r>
         <w:rPr>
           <w:rFonts w:asciiTheme="majorHAnsi" w:eastAsiaTheme="majorEastAsia" w:hAnsiTheme="majorHAnsi" w:cstheme="majorBidi"/>
           <w:bCs/>
           <w:spacing w:val="-10"/>
           <w:kern w:val="28"/>
         </w:rPr>
-      </w:pPr>
+        <w:t xml:space="preserve">In ES Modules kann </w:t>
+      </w:r>
+      <w:proofErr w:type="spellStart"/>
       <w:r>
         <w:rPr>
           <w:rFonts w:asciiTheme="majorHAnsi" w:eastAsiaTheme="majorEastAsia" w:hAnsiTheme="majorHAnsi" w:cstheme="majorBidi"/>
@@ -34132,9 +33611,9 @@
           <w:spacing w:val="-10"/>
           <w:kern w:val="28"/>
         </w:rPr>
-        <w:t xml:space="preserve">In ES Modules kann </w:t>
-      </w:r>
-      <w:proofErr w:type="spellStart"/>
+        <w:t>await</w:t>
+      </w:r>
+      <w:proofErr w:type="spellEnd"/>
       <w:r>
         <w:rPr>
           <w:rFonts w:asciiTheme="majorHAnsi" w:eastAsiaTheme="majorEastAsia" w:hAnsiTheme="majorHAnsi" w:cstheme="majorBidi"/>
@@ -34142,9 +33621,9 @@
           <w:spacing w:val="-10"/>
           <w:kern w:val="28"/>
         </w:rPr>
-        <w:t>await</w:t>
-      </w:r>
-      <w:proofErr w:type="spellEnd"/>
+        <w:t xml:space="preserve"> direkt auf oberster Ebene verwendet werden, etwa beim Aufbau der Datenbankverbindung. Express 5 leitet Fehler aus </w:t>
+      </w:r>
+      <w:proofErr w:type="spellStart"/>
       <w:r>
         <w:rPr>
           <w:rFonts w:asciiTheme="majorHAnsi" w:eastAsiaTheme="majorEastAsia" w:hAnsiTheme="majorHAnsi" w:cstheme="majorBidi"/>
@@ -34152,9 +33631,9 @@
           <w:spacing w:val="-10"/>
           <w:kern w:val="28"/>
         </w:rPr>
-        <w:t xml:space="preserve"> direkt auf oberster Ebene verwendet werden, etwa beim Aufbau der Datenbankverbindung. Express 5 leitet Fehler aus </w:t>
-      </w:r>
-      <w:proofErr w:type="spellStart"/>
+        <w:t>async</w:t>
+      </w:r>
+      <w:proofErr w:type="spellEnd"/>
       <w:r>
         <w:rPr>
           <w:rFonts w:asciiTheme="majorHAnsi" w:eastAsiaTheme="majorEastAsia" w:hAnsiTheme="majorHAnsi" w:cstheme="majorBidi"/>
@@ -34162,9 +33641,9 @@
           <w:spacing w:val="-10"/>
           <w:kern w:val="28"/>
         </w:rPr>
-        <w:t>async</w:t>
-      </w:r>
-      <w:proofErr w:type="spellEnd"/>
+        <w:t xml:space="preserve">-Funktionen automatisch an die Fehlerbehandlung weiter. So kann das ganze Backend durchgehend mit </w:t>
+      </w:r>
+      <w:proofErr w:type="spellStart"/>
       <w:r>
         <w:rPr>
           <w:rFonts w:asciiTheme="majorHAnsi" w:eastAsiaTheme="majorEastAsia" w:hAnsiTheme="majorHAnsi" w:cstheme="majorBidi"/>
@@ -34172,9 +33651,9 @@
           <w:spacing w:val="-10"/>
           <w:kern w:val="28"/>
         </w:rPr>
-        <w:t xml:space="preserve">-Funktionen automatisch an die Fehlerbehandlung weiter. So kann das ganze </w:t>
-      </w:r>
-      <w:proofErr w:type="gramStart"/>
+        <w:t>async</w:t>
+      </w:r>
+      <w:proofErr w:type="spellEnd"/>
       <w:r>
         <w:rPr>
           <w:rFonts w:asciiTheme="majorHAnsi" w:eastAsiaTheme="majorEastAsia" w:hAnsiTheme="majorHAnsi" w:cstheme="majorBidi"/>
@@ -34182,9 +33661,9 @@
           <w:spacing w:val="-10"/>
           <w:kern w:val="28"/>
         </w:rPr>
-        <w:t>Backend</w:t>
-      </w:r>
-      <w:proofErr w:type="gramEnd"/>
+        <w:t>/</w:t>
+      </w:r>
+      <w:proofErr w:type="spellStart"/>
       <w:r>
         <w:rPr>
           <w:rFonts w:asciiTheme="majorHAnsi" w:eastAsiaTheme="majorEastAsia" w:hAnsiTheme="majorHAnsi" w:cstheme="majorBidi"/>
@@ -34192,9 +33671,9 @@
           <w:spacing w:val="-10"/>
           <w:kern w:val="28"/>
         </w:rPr>
-        <w:t xml:space="preserve"> durchgehend mit </w:t>
-      </w:r>
-      <w:proofErr w:type="spellStart"/>
+        <w:t>await</w:t>
+      </w:r>
+      <w:proofErr w:type="spellEnd"/>
       <w:r>
         <w:rPr>
           <w:rFonts w:asciiTheme="majorHAnsi" w:eastAsiaTheme="majorEastAsia" w:hAnsiTheme="majorHAnsi" w:cstheme="majorBidi"/>
@@ -34202,9 +33681,8 @@
           <w:spacing w:val="-10"/>
           <w:kern w:val="28"/>
         </w:rPr>
-        <w:t>async</w:t>
-      </w:r>
-      <w:proofErr w:type="spellEnd"/>
+        <w:t xml:space="preserve"> geschrieben werden</w:t>
+      </w:r>
       <w:r>
         <w:rPr>
           <w:rFonts w:asciiTheme="majorHAnsi" w:eastAsiaTheme="majorEastAsia" w:hAnsiTheme="majorHAnsi" w:cstheme="majorBidi"/>
@@ -34212,28 +33690,28 @@
           <w:spacing w:val="-10"/>
           <w:kern w:val="28"/>
         </w:rPr>
-        <w:t>/</w:t>
-      </w:r>
-      <w:proofErr w:type="spellStart"/>
-      <w:r>
+        <w:t xml:space="preserve">. </w:t>
+      </w:r>
+    </w:p>
+    <w:p>
+      <w:pPr>
         <w:rPr>
           <w:rFonts w:asciiTheme="majorHAnsi" w:eastAsiaTheme="majorEastAsia" w:hAnsiTheme="majorHAnsi" w:cstheme="majorBidi"/>
           <w:bCs/>
           <w:spacing w:val="-10"/>
           <w:kern w:val="28"/>
         </w:rPr>
-        <w:t>await</w:t>
-      </w:r>
-      <w:proofErr w:type="spellEnd"/>
-      <w:r>
+      </w:pPr>
+    </w:p>
+    <w:p>
+      <w:pPr>
         <w:rPr>
           <w:rFonts w:asciiTheme="majorHAnsi" w:eastAsiaTheme="majorEastAsia" w:hAnsiTheme="majorHAnsi" w:cstheme="majorBidi"/>
           <w:bCs/>
           <w:spacing w:val="-10"/>
           <w:kern w:val="28"/>
         </w:rPr>
-        <w:t xml:space="preserve"> geschrieben werden</w:t>
-      </w:r>
+      </w:pPr>
       <w:r>
         <w:rPr>
           <w:rFonts w:asciiTheme="majorHAnsi" w:eastAsiaTheme="majorEastAsia" w:hAnsiTheme="majorHAnsi" w:cstheme="majorBidi"/>
@@ -34241,28 +33719,29 @@
           <w:spacing w:val="-10"/>
           <w:kern w:val="28"/>
         </w:rPr>
-        <w:t xml:space="preserve">. </w:t>
-      </w:r>
-    </w:p>
-    <w:p>
-      <w:pPr>
+        <w:t xml:space="preserve">Damit </w:t>
+      </w:r>
+      <w:proofErr w:type="spellStart"/>
+      <w:r>
         <w:rPr>
           <w:rFonts w:asciiTheme="majorHAnsi" w:eastAsiaTheme="majorEastAsia" w:hAnsiTheme="majorHAnsi" w:cstheme="majorBidi"/>
           <w:bCs/>
           <w:spacing w:val="-10"/>
           <w:kern w:val="28"/>
         </w:rPr>
-      </w:pPr>
-    </w:p>
-    <w:p>
-      <w:pPr>
+        <w:t>npm</w:t>
+      </w:r>
+      <w:proofErr w:type="spellEnd"/>
+      <w:r>
         <w:rPr>
           <w:rFonts w:asciiTheme="majorHAnsi" w:eastAsiaTheme="majorEastAsia" w:hAnsiTheme="majorHAnsi" w:cstheme="majorBidi"/>
           <w:bCs/>
           <w:spacing w:val="-10"/>
           <w:kern w:val="28"/>
         </w:rPr>
-      </w:pPr>
+        <w:t xml:space="preserve"> </w:t>
+      </w:r>
+      <w:proofErr w:type="spellStart"/>
       <w:r>
         <w:rPr>
           <w:rFonts w:asciiTheme="majorHAnsi" w:eastAsiaTheme="majorEastAsia" w:hAnsiTheme="majorHAnsi" w:cstheme="majorBidi"/>
@@ -34270,9 +33749,9 @@
           <w:spacing w:val="-10"/>
           <w:kern w:val="28"/>
         </w:rPr>
-        <w:t xml:space="preserve">Damit </w:t>
-      </w:r>
-      <w:proofErr w:type="spellStart"/>
+        <w:t>test</w:t>
+      </w:r>
+      <w:proofErr w:type="spellEnd"/>
       <w:r>
         <w:rPr>
           <w:rFonts w:asciiTheme="majorHAnsi" w:eastAsiaTheme="majorEastAsia" w:hAnsiTheme="majorHAnsi" w:cstheme="majorBidi"/>
@@ -34280,9 +33759,9 @@
           <w:spacing w:val="-10"/>
           <w:kern w:val="28"/>
         </w:rPr>
-        <w:t>npm</w:t>
-      </w:r>
-      <w:proofErr w:type="spellEnd"/>
+        <w:t xml:space="preserve"> mit ES Modules funktioniert, muss das test-</w:t>
+      </w:r>
+      <w:proofErr w:type="spellStart"/>
       <w:r>
         <w:rPr>
           <w:rFonts w:asciiTheme="majorHAnsi" w:eastAsiaTheme="majorEastAsia" w:hAnsiTheme="majorHAnsi" w:cstheme="majorBidi"/>
@@ -34290,9 +33769,9 @@
           <w:spacing w:val="-10"/>
           <w:kern w:val="28"/>
         </w:rPr>
-        <w:t xml:space="preserve"> </w:t>
-      </w:r>
-      <w:proofErr w:type="spellStart"/>
+        <w:t>Script</w:t>
+      </w:r>
+      <w:proofErr w:type="spellEnd"/>
       <w:r>
         <w:rPr>
           <w:rFonts w:asciiTheme="majorHAnsi" w:eastAsiaTheme="majorEastAsia" w:hAnsiTheme="majorHAnsi" w:cstheme="majorBidi"/>
@@ -34300,9 +33779,9 @@
           <w:spacing w:val="-10"/>
           <w:kern w:val="28"/>
         </w:rPr>
-        <w:t>test</w:t>
-      </w:r>
-      <w:proofErr w:type="spellEnd"/>
+        <w:t xml:space="preserve"> in der </w:t>
+      </w:r>
+      <w:proofErr w:type="spellStart"/>
       <w:r>
         <w:rPr>
           <w:rFonts w:asciiTheme="majorHAnsi" w:eastAsiaTheme="majorEastAsia" w:hAnsiTheme="majorHAnsi" w:cstheme="majorBidi"/>
@@ -34310,41 +33789,9 @@
           <w:spacing w:val="-10"/>
           <w:kern w:val="28"/>
         </w:rPr>
-        <w:t xml:space="preserve"> mit ES Modules funktioniert, muss das test-</w:t>
-      </w:r>
-      <w:proofErr w:type="spellStart"/>
-      <w:r>
-        <w:rPr>
-          <w:rFonts w:asciiTheme="majorHAnsi" w:eastAsiaTheme="majorEastAsia" w:hAnsiTheme="majorHAnsi" w:cstheme="majorBidi"/>
-          <w:bCs/>
-          <w:spacing w:val="-10"/>
-          <w:kern w:val="28"/>
-        </w:rPr>
-        <w:t>Script</w:t>
+        <w:t>package.json</w:t>
       </w:r>
       <w:proofErr w:type="spellEnd"/>
-      <w:r>
-        <w:rPr>
-          <w:rFonts w:asciiTheme="majorHAnsi" w:eastAsiaTheme="majorEastAsia" w:hAnsiTheme="majorHAnsi" w:cstheme="majorBidi"/>
-          <w:bCs/>
-          <w:spacing w:val="-10"/>
-          <w:kern w:val="28"/>
-        </w:rPr>
-        <w:t xml:space="preserve"> in der </w:t>
-      </w:r>
-      <w:proofErr w:type="spellStart"/>
-      <w:proofErr w:type="gramStart"/>
-      <w:r>
-        <w:rPr>
-          <w:rFonts w:asciiTheme="majorHAnsi" w:eastAsiaTheme="majorEastAsia" w:hAnsiTheme="majorHAnsi" w:cstheme="majorBidi"/>
-          <w:bCs/>
-          <w:spacing w:val="-10"/>
-          <w:kern w:val="28"/>
-        </w:rPr>
-        <w:t>package.json</w:t>
-      </w:r>
-      <w:proofErr w:type="spellEnd"/>
-      <w:proofErr w:type="gramEnd"/>
       <w:r>
         <w:rPr>
           <w:rFonts w:asciiTheme="majorHAnsi" w:eastAsiaTheme="majorEastAsia" w:hAnsiTheme="majorHAnsi" w:cstheme="majorBidi"/>
@@ -34629,27 +34076,7 @@
           <w:spacing w:val="-10"/>
           <w:kern w:val="28"/>
         </w:rPr>
-        <w:t xml:space="preserve">XAMPP ist ein einfach zu installierendes Paket </w:t>
-      </w:r>
-      <w:proofErr w:type="gramStart"/>
-      <w:r>
-        <w:rPr>
-          <w:rFonts w:asciiTheme="majorHAnsi" w:eastAsiaTheme="majorEastAsia" w:hAnsiTheme="majorHAnsi" w:cstheme="majorBidi"/>
-          <w:bCs/>
-          <w:spacing w:val="-10"/>
-          <w:kern w:val="28"/>
-        </w:rPr>
-        <w:t>mit Apache</w:t>
-      </w:r>
-      <w:proofErr w:type="gramEnd"/>
-      <w:r>
-        <w:rPr>
-          <w:rFonts w:asciiTheme="majorHAnsi" w:eastAsiaTheme="majorEastAsia" w:hAnsiTheme="majorHAnsi" w:cstheme="majorBidi"/>
-          <w:bCs/>
-          <w:spacing w:val="-10"/>
-          <w:kern w:val="28"/>
-        </w:rPr>
-        <w:t xml:space="preserve">, </w:t>
+        <w:t xml:space="preserve">XAMPP ist ein einfach zu installierendes Paket mit Apache, </w:t>
       </w:r>
       <w:proofErr w:type="spellStart"/>
       <w:r>
@@ -35081,17 +34508,97 @@
       <w:pPr>
         <w:spacing w:after="160" w:line="259" w:lineRule="auto"/>
         <w:rPr>
+          <w:rFonts w:asciiTheme="majorHAnsi" w:hAnsiTheme="majorHAnsi"/>
+        </w:rPr>
+      </w:pPr>
+      <w:r>
+        <w:rPr>
+          <w:rFonts w:asciiTheme="majorHAnsi" w:hAnsiTheme="majorHAnsi"/>
+        </w:rPr>
+        <w:t xml:space="preserve">Siehe Kriterienkatalog für IPA. </w:t>
+      </w:r>
+    </w:p>
+    <w:p>
+      <w:pPr>
+        <w:spacing w:after="160" w:line="259" w:lineRule="auto"/>
+        <w:rPr>
+          <w:rFonts w:asciiTheme="majorHAnsi" w:hAnsiTheme="majorHAnsi"/>
+        </w:rPr>
+      </w:pPr>
+      <w:r>
+        <w:rPr>
+          <w:rFonts w:asciiTheme="majorHAnsi" w:hAnsiTheme="majorHAnsi"/>
+        </w:rPr>
+        <w:drawing>
+          <wp:inline distT="0" distB="0" distL="0" distR="0" wp14:anchorId="22466F83" wp14:editId="0330B183">
+            <wp:extent cx="3534268" cy="1390844"/>
+            <wp:effectExtent l="0" t="0" r="9525" b="0"/>
+            <wp:docPr id="1888579918" name="Grafik 1"/>
+            <wp:cNvGraphicFramePr>
+              <a:graphicFrameLocks xmlns:a="http://schemas.openxmlformats.org/drawingml/2006/main" noChangeAspect="1"/>
+            </wp:cNvGraphicFramePr>
+            <a:graphic xmlns:a="http://schemas.openxmlformats.org/drawingml/2006/main">
+              <a:graphicData uri="http://schemas.openxmlformats.org/drawingml/2006/picture">
+                <pic:pic xmlns:pic="http://schemas.openxmlformats.org/drawingml/2006/picture">
+                  <pic:nvPicPr>
+                    <pic:cNvPr id="1888579918" name=""/>
+                    <pic:cNvPicPr/>
+                  </pic:nvPicPr>
+                  <pic:blipFill>
+                    <a:blip r:embed="rId17"/>
+                    <a:stretch>
+                      <a:fillRect/>
+                    </a:stretch>
+                  </pic:blipFill>
+                  <pic:spPr>
+                    <a:xfrm>
+                      <a:off x="0" y="0"/>
+                      <a:ext cx="3534268" cy="1390844"/>
+                    </a:xfrm>
+                    <a:prstGeom prst="rect">
+                      <a:avLst/>
+                    </a:prstGeom>
+                  </pic:spPr>
+                </pic:pic>
+              </a:graphicData>
+            </a:graphic>
+          </wp:inline>
+        </w:drawing>
+      </w:r>
+    </w:p>
+    <w:p>
+      <w:pPr>
+        <w:spacing w:after="160" w:line="259" w:lineRule="auto"/>
+        <w:rPr>
+          <w:rFonts w:asciiTheme="majorHAnsi" w:hAnsiTheme="majorHAnsi"/>
+        </w:rPr>
+      </w:pPr>
+      <w:proofErr w:type="spellStart"/>
+      <w:r>
+        <w:rPr>
+          <w:rFonts w:asciiTheme="majorHAnsi" w:hAnsiTheme="majorHAnsi"/>
+        </w:rPr>
+        <w:t>ss</w:t>
+      </w:r>
+      <w:proofErr w:type="spellEnd"/>
+    </w:p>
+    <w:p>
+      <w:pPr>
+        <w:spacing w:after="160" w:line="259" w:lineRule="auto"/>
+        <w:rPr>
+          <w:rFonts w:asciiTheme="majorHAnsi" w:hAnsiTheme="majorHAnsi"/>
+        </w:rPr>
+      </w:pPr>
+    </w:p>
+    <w:p>
+      <w:pPr>
+        <w:spacing w:after="160" w:line="259" w:lineRule="auto"/>
+        <w:rPr>
           <w:rFonts w:asciiTheme="majorHAnsi" w:eastAsiaTheme="majorEastAsia" w:hAnsiTheme="majorHAnsi" w:cstheme="majorBidi"/>
           <w:b/>
           <w:color w:val="404040" w:themeColor="text1" w:themeTint="BF"/>
         </w:rPr>
       </w:pPr>
-      <w:r>
-        <w:rPr>
-          <w:rFonts w:asciiTheme="majorHAnsi" w:hAnsiTheme="majorHAnsi"/>
-        </w:rPr>
-        <w:t xml:space="preserve">Siehe Kriterienkatalog für IPA. </w:t>
-      </w:r>
       <w:r>
         <w:rPr>
           <w:rFonts w:asciiTheme="majorHAnsi" w:hAnsiTheme="majorHAnsi"/>
@@ -51682,8 +51189,8 @@
       </w:pPr>
     </w:p>
     <w:sectPr>
-      <w:headerReference w:type="default" r:id="rId17"/>
-      <w:footerReference w:type="default" r:id="rId18"/>
+      <w:headerReference w:type="default" r:id="rId18"/>
+      <w:footerReference w:type="default" r:id="rId19"/>
       <w:pgSz w:w="11906" w:h="16838" w:code="9"/>
       <w:pgMar w:top="2835" w:right="1701" w:bottom="1134" w:left="1247" w:header="1560" w:footer="737" w:gutter="0"/>
       <w:cols w:space="708"/>
@@ -51882,7 +51389,6 @@
                             <w:t xml:space="preserve"> | </w:t>
                           </w:r>
                           <w:proofErr w:type="spellStart"/>
-                          <w:proofErr w:type="gramStart"/>
                           <w:r>
                             <w:rPr>
                               <w:sz w:val="16"/>
@@ -51891,7 +51397,6 @@
                             <w:t>twofold.swiss</w:t>
                           </w:r>
                           <w:proofErr w:type="spellEnd"/>
-                          <w:proofErr w:type="gramEnd"/>
                         </w:p>
                       </w:txbxContent>
                     </wps:txbx>
@@ -52018,7 +51523,6 @@
                       <w:t xml:space="preserve"> | </w:t>
                     </w:r>
                     <w:proofErr w:type="spellStart"/>
-                    <w:proofErr w:type="gramStart"/>
                     <w:r>
                       <w:rPr>
                         <w:sz w:val="16"/>
@@ -52027,7 +51531,6 @@
                       <w:t>twofold.swiss</w:t>
                     </w:r>
                     <w:proofErr w:type="spellEnd"/>
-                    <w:proofErr w:type="gramEnd"/>
                   </w:p>
                 </w:txbxContent>
               </v:textbox>
@@ -52350,7 +51853,6 @@
                             <w:t xml:space="preserve"> | </w:t>
                           </w:r>
                           <w:proofErr w:type="spellStart"/>
-                          <w:proofErr w:type="gramStart"/>
                           <w:r>
                             <w:rPr>
                               <w:sz w:val="16"/>
@@ -52359,7 +51861,6 @@
                             <w:t>twofold.swiss</w:t>
                           </w:r>
                           <w:proofErr w:type="spellEnd"/>
-                          <w:proofErr w:type="gramEnd"/>
                         </w:p>
                       </w:txbxContent>
                     </wps:txbx>
@@ -52486,7 +51987,6 @@
                       <w:t xml:space="preserve"> | </w:t>
                     </w:r>
                     <w:proofErr w:type="spellStart"/>
-                    <w:proofErr w:type="gramStart"/>
                     <w:r>
                       <w:rPr>
                         <w:sz w:val="16"/>
@@ -52495,7 +51995,6 @@
                       <w:t>twofold.swiss</w:t>
                     </w:r>
                     <w:proofErr w:type="spellEnd"/>
-                    <w:proofErr w:type="gramEnd"/>
                   </w:p>
                 </w:txbxContent>
               </v:textbox>
@@ -52971,7 +52470,6 @@
                             <w:t xml:space="preserve"> | </w:t>
                           </w:r>
                           <w:proofErr w:type="spellStart"/>
-                          <w:proofErr w:type="gramStart"/>
                           <w:r>
                             <w:rPr>
                               <w:sz w:val="16"/>
@@ -52980,7 +52478,6 @@
                             <w:t>twofold.swiss</w:t>
                           </w:r>
                           <w:proofErr w:type="spellEnd"/>
-                          <w:proofErr w:type="gramEnd"/>
                         </w:p>
                       </w:txbxContent>
                     </wps:txbx>
@@ -53107,7 +52604,6 @@
                       <w:t xml:space="preserve"> | </w:t>
                     </w:r>
                     <w:proofErr w:type="spellStart"/>
-                    <w:proofErr w:type="gramStart"/>
                     <w:r>
                       <w:rPr>
                         <w:sz w:val="16"/>
@@ -53116,7 +52612,6 @@
                       <w:t>twofold.swiss</w:t>
                     </w:r>
                     <w:proofErr w:type="spellEnd"/>
-                    <w:proofErr w:type="gramEnd"/>
                   </w:p>
                 </w:txbxContent>
               </v:textbox>
@@ -60558,6 +60053,7 @@
   <w:style w:type="character" w:default="1" w:styleId="Absatz-Standardschriftart">
     <w:name w:val="Default Paragraph Font"/>
     <w:uiPriority w:val="1"/>
+    <w:semiHidden/>
     <w:unhideWhenUsed/>
   </w:style>
   <w:style w:type="table" w:default="1" w:styleId="NormaleTabelle">

</xml_diff>